<commit_message>
Cover letter: reviewer and prior-discussion lines filled
Co-Authored-By: Claude Sonnet 5.5 <noreply@anthropic.com>
Claude-Session: https://claude.ai/code/session_019rg5o9hDTDUTznqt5xBjmb
</commit_message>
<xml_diff>
--- a/paper2/final/SciRep/Cover_letter.docx
+++ b/paper2/final/SciRep/Cover_letter.docx
@@ -36,17 +36,17 @@
     </w:p>
     <w:p>
       <w:r>
-        <w:t>Suggested reviewers: [authors to supply names, affiliations and e-mail addresses].</w:t>
+        <w:t>Suggested reviewers: none; we leave the choice of reviewers to the Editorial Board Member.</w:t>
       </w:r>
     </w:p>
     <w:p>
       <w:r>
-        <w:t>Excluded referees: [authors to supply names, or state none].</w:t>
+        <w:t>Excluded referees: none.</w:t>
       </w:r>
     </w:p>
     <w:p>
       <w:r>
-        <w:t>Prior discussion with an Editorial Board Member: [authors to confirm; state none if there was no discussion].</w:t>
+        <w:t>Prior discussion with an Editorial Board Member: none.</w:t>
       </w:r>
     </w:p>
     <w:p>

</xml_diff>